<commit_message>
Record the clean-environment run of Appendix D from the tag
The whole appendix was run from a clean clone of the tagged tree in a fresh
virtual environment built only from requirements-validated.txt. All fourteen
steps passed in one hour and fifty-three minutes, and every recorded number
reproduced with no mismatches: the confusion counts of all ten runs of the
robustness round, the component breakdown, the baseline table, the parity
metrics and summary, and precision and recall of 1.0000 on the canonical suite.
Feature validity agreed to within 6e-16, which is the pandas version.

The evidence index now points at the tagged commit, and the report's page
numbers were measured again after the change.
</commit_message>
<xml_diff>
--- a/docs/deliverables/SAMUEL KAOMA 2022016530 Final Report.docx
+++ b/docs/deliverables/SAMUEL KAOMA 2022016530 Final Report.docx
@@ -391,7 +391,7 @@
       </w:pPr>
     </w:p>
     <w:p xmlns:w14="http://schemas.microsoft.com/office/word/2010/wordml"/>
-    <w:bookmarkStart w:id="1861" w:name="declaration"/>
+    <w:bookmarkStart w:id="1957" w:name="declaration"/>
     <w:p>
       <w:pPr>
         <w:pStyle w:val="Heading1"/>
@@ -510,8 +510,8 @@
         </w:pict>
       </w:r>
     </w:p>
-    <w:bookmarkEnd w:id="1861"/>
-    <w:bookmarkStart w:id="1862" w:name="conventions-used-in-this-report"/>
+    <w:bookmarkEnd w:id="1957"/>
+    <w:bookmarkStart w:id="1958" w:name="conventions-used-in-this-report"/>
     <w:p>
       <w:pPr>
         <w:pStyle w:val="Heading1"/>
@@ -628,8 +628,8 @@
         </w:pict>
       </w:r>
     </w:p>
-    <w:bookmarkEnd w:id="1862"/>
-    <w:bookmarkStart w:id="1863" w:name="table-of-contents"/>
+    <w:bookmarkEnd w:id="1958"/>
+    <w:bookmarkStart w:id="1959" w:name="table-of-contents"/>
     <w:p>
       <w:pPr>
         <w:pStyle w:val="Heading1"/>
@@ -2901,8 +2901,8 @@
         </w:tc>
       </w:tr>
     </w:tbl>
-    <w:bookmarkEnd w:id="1863"/>
-    <w:bookmarkStart w:id="1864" w:name="list-of-tables"/>
+    <w:bookmarkEnd w:id="1959"/>
+    <w:bookmarkStart w:id="1960" w:name="list-of-tables"/>
     <w:p>
       <w:pPr>
         <w:pStyle w:val="Heading1"/>
@@ -4145,8 +4145,8 @@
         </w:tc>
       </w:tr>
     </w:tbl>
-    <w:bookmarkEnd w:id="1864"/>
-    <w:bookmarkStart w:id="1865" w:name="list-of-figures"/>
+    <w:bookmarkEnd w:id="1960"/>
+    <w:bookmarkStart w:id="1961" w:name="list-of-figures"/>
     <w:p>
       <w:pPr>
         <w:pStyle w:val="Heading1"/>
@@ -4352,8 +4352,8 @@
         </w:pict>
       </w:r>
     </w:p>
-    <w:bookmarkEnd w:id="1865"/>
-    <w:bookmarkStart w:id="1866" w:name="abstract"/>
+    <w:bookmarkEnd w:id="1961"/>
+    <w:bookmarkStart w:id="1962" w:name="abstract"/>
     <w:p>
       <w:pPr>
         <w:pStyle w:val="Heading1"/>
@@ -4370,8 +4370,8 @@
         <w:t xml:space="preserve">Digital data collection platforms such as SurveyCTO and ODK Collect record detailed process data, commonly called paradata, alongside every interview. These audit logs hold timestamps, navigation events and validation errors that describe how an interview was conducted rather than what was answered. Survey methodology research has shown that such timing data can expose falsified interviews and speeding, yet paradata remains underused in practice. The platforms' own quality tools act field by field or interview by interview, and the raw logs differ across platforms, so turning them into a comparable set of interview-level indicators is left to each survey team. This study designed, implemented and evaluated an automated pipeline that parses SurveyCTO and ODK audit logs into a common intermediate representation, computes forty timing-based features across question, section and survey levels of granularity together with a statistical characterisation of each response time distribution, and flags anomalous interviews using interquartile range thresholds combined with transparent, configurable rules. The system was evaluated against synthetic benchmark datasets with labelled injected anomalies, including datasets generated from random seeds that were never used during development and a stress condition in which normal and anomalous behaviour deliberately overlap. Across a class imbalance sweep from five to thirty percent anomaly prevalence the detector achieved precision between 0.96 and 1.00 with full recall. On held-out stress datasets in both platform formats it achieved precision between 0.96 and 1.00 and recall between 0.84 and 0.89, exceeding the predefined success criteria of 0.80 precision and 0.75 recall. The duration-only check that represents current practice recovered 66 of 100 anomalies on the canonical benchmark and none of the 400 in the held-out stress runs, where a single navigation rule recovered between 35 and 51 percent at precision below 0.22. When the same generated interviews were written in both formats, all forty features and every detector decision were identical, so the differences between the two formats' runs reflect different sampled interviews rather than the parsers. Across the stress runs speeding was detected in all 132 cases, disengagement in 121 of 136, and mild fabrication in 93 of 132. A diagnostic pass on those missed fabrications, run on development data only, found that response time entropy separates them from genuine interviews without overlap, so the shortfall is traced to threshold calibration rather than to any absence of signal in the features. The deliverables include a documented Python feature library, a paradata format guide, labelled validation datasets and this report.</w:t>
       </w:r>
     </w:p>
-    <w:bookmarkEnd w:id="1866"/>
-    <w:bookmarkStart w:id="1873" w:name="Xe3d0fc0bea9a42ce7605565d0964033d7f6ee47"/>
+    <w:bookmarkEnd w:id="1962"/>
+    <w:bookmarkStart w:id="1969" w:name="Xe3d0fc0bea9a42ce7605565d0964033d7f6ee47"/>
     <w:p>
       <w:pPr>
         <w:pStyle w:val="Heading1"/>
@@ -4396,7 +4396,7 @@
         <w:t xml:space="preserve">These behavioural traces carry diagnostic value that conventional quality checks cannot match. Unusually fast completion may indicate rushed or fabricated responses, extended pauses may signal confusion or interruption, and atypical navigation patterns may point to satisficing behaviour, in which respondents or enumerators invest only the minimum effort required to move forward (Krosnick, 1991; Yan and Tourangeau, 2008). Despite this potential, paradata is routinely underused. Audit logs from SurveyCTO and ODK differ in structure, field naming and timing granularity, and the statistical work needed to convert millions of raw event rows into defensible quality indicators is beyond the reach of most survey teams (Kreuter, 2013).</w:t>
       </w:r>
     </w:p>
-    <w:bookmarkStart w:id="1867" w:name="X8ed7113c30baefd0a0d5373f9e8fb0f217861be"/>
+    <w:bookmarkStart w:id="1963" w:name="X8ed7113c30baefd0a0d5373f9e8fb0f217861be"/>
     <w:p>
       <w:pPr>
         <w:pStyle w:val="Heading2"/>
@@ -4413,8 +4413,8 @@
         <w:t xml:space="preserve">Existing survey quality assurance practice relies largely on aggregate indicators, chiefly total interview duration, together with manual back-checking of a sample of interviews. These methods are poorly equipped to detect behavioural irregularities that occur during the interview, such as uniform pacing across questions of very different complexity, or timing that is compressed and unusually consistent across an interview (Bushery et al., 1999; Bredl et al., 2012; Schwanhäuser et al., 2022). The raw material needed to detect these patterns is already collected. ODK Collect can attach an audit log of timestamped question views, jumps and form events to every submission (ODK, n.d.), and SurveyCTO records per-field timing in its text audits (SurveyCTO, n.d.-a). SurveyCTO also offers quality tools of its own, including a minimum time per field with a count of speed violations, and automated checks that warn about quality concerns in incoming data (SurveyCTO, n.d.-b). What neither platform provides is a common set of timing features computed the same way for both, combined into an interview-level score that names the signals that fired and uses thresholds suited to the skewed, non-normal distributions typical of response times (Iglewicz and Hoaglin, 1993). That gap, rather than an absence of data or of any tooling, is what this project addresses.</w:t>
       </w:r>
     </w:p>
-    <w:bookmarkEnd w:id="1867"/>
-    <w:bookmarkStart w:id="1868" w:name="X11914782bf4ddd361c09301a1599eaa2860f3c5"/>
+    <w:bookmarkEnd w:id="1963"/>
+    <w:bookmarkStart w:id="1964" w:name="X11914782bf4ddd361c09301a1599eaa2860f3c5"/>
     <w:p>
       <w:pPr>
         <w:pStyle w:val="Heading2"/>
@@ -4431,8 +4431,8 @@
         <w:t xml:space="preserve">The aim of this project was to design and implement an automated pipeline for extracting, cataloguing and analysing timing-based paradata features from SurveyCTO and ODK audit logs in order to support scalable survey data quality assessment.</w:t>
       </w:r>
     </w:p>
-    <w:bookmarkEnd w:id="1868"/>
-    <w:bookmarkStart w:id="1869" w:name="X20170cc6f1120ca210884b45e182ac79340b39a"/>
+    <w:bookmarkEnd w:id="1964"/>
+    <w:bookmarkStart w:id="1965" w:name="X20170cc6f1120ca210884b45e182ac79340b39a"/>
     <w:p>
       <w:pPr>
         <w:pStyle w:val="Heading2"/>
@@ -4513,8 +4513,8 @@
         <w:t xml:space="preserve">To generate structured output datasets, feature documentation and a paradata format guide suitable for reuse by survey researchers.</w:t>
       </w:r>
     </w:p>
-    <w:bookmarkEnd w:id="1869"/>
-    <w:bookmarkStart w:id="1870" w:name="X1f4012e9c4b62781074de2916856df2f3df4c87"/>
+    <w:bookmarkEnd w:id="1965"/>
+    <w:bookmarkStart w:id="1966" w:name="X1f4012e9c4b62781074de2916856df2f3df4c87"/>
     <w:p>
       <w:pPr>
         <w:pStyle w:val="Heading2"/>
@@ -4531,8 +4531,8 @@
         <w:t xml:space="preserve">The project processes audit logs from SurveyCTO and ODK, extracts forty timing-based and behavioural features, characterises response patterns statistically, applies interquartile range and rule-based anomaly detection, and validates the system empirically using synthetic datasets with labelled anomalies. Real-time monitoring, dashboard integration, machine learning deployment and primary data collection were excluded from scope at proposal stage and remain so.</w:t>
       </w:r>
     </w:p>
-    <w:bookmarkEnd w:id="1870"/>
-    <w:bookmarkStart w:id="1871" w:name="Xa906394427374498867f33f455f91a79a7371f9"/>
+    <w:bookmarkEnd w:id="1966"/>
+    <w:bookmarkStart w:id="1967" w:name="Xa906394427374498867f33f455f91a79a7371f9"/>
     <w:p>
       <w:pPr>
         <w:pStyle w:val="Heading2"/>
@@ -4549,8 +4549,8 @@
         <w:t xml:space="preserve">This work makes four contributions. The first is a format-agnostic intermediate representation for survey paradata, a six-column normalisation of SurveyCTO and ODK audit logs that decouples every downstream component from platform specifics, so that supporting an additional platform requires a new parser and no change to the feature library, the detector or the reporting layer. The second is a documented and tested feature library of forty timing-based indicators with stable identifiers spanning question, section and survey granularity together with a statistical characterisation of each interview's response time distribution, released with a coverage table that states for every feature where it is implemented, whether the pipeline exported it, and how it is tested. The third is a like-for-like baseline comparison, in which the full detector and two methods representing current practice are computed from the same raw files, the same features and the same ground truth inside a single audited script, so that the improvement over aggregate-duration checking is measured rather than asserted. The fourth is an evaluation designed to fail: held-out seeds, a stress difficulty in which normal and anomalous profiles overlap by construction, a class prevalence sweep, and a component breakdown that isolates and reports the weaker half of the author's own detector.</w:t>
       </w:r>
     </w:p>
-    <w:bookmarkEnd w:id="1871"/>
-    <w:bookmarkStart w:id="1872" w:name="X5a51de1b548662e04eb65c9b9903b1e3a39efe3"/>
+    <w:bookmarkEnd w:id="1967"/>
+    <w:bookmarkStart w:id="1968" w:name="X5a51de1b548662e04eb65c9b9903b1e3a39efe3"/>
     <w:p>
       <w:pPr>
         <w:pStyle w:val="Heading2"/>
@@ -4567,9 +4567,9 @@
         <w:t xml:space="preserve">Section 2 reviews the literature in five themes: paradata and total survey error, response time and satisficing, falsification detection, paradata in low-resource field collection, and outlier detection on skewed data. Section 3 sets out the methodology, including the common intermediate representation, the forty-feature taxonomy and the detector with its default thresholds. Section 4 describes the implementation and the defects found and fixed during development. Section 5 describes the synthetic data generator, the safeguards against overfitting, the datasets and the baselines, and section 6 reports the results. Section 7 discusses what the results support and what they do not, section 8 states the limitations, and section 9 concludes with a reflection on the project. The appendices give the disclosure of artificial intelligence use (A), per-run confusion counts (B), the full feature validity results (C), the reproduction commands (D), the record of reference verification (E) and the map from each feature to its source (F).</w:t>
       </w:r>
     </w:p>
-    <w:bookmarkEnd w:id="1872"/>
-    <w:bookmarkEnd w:id="1873"/>
-    <w:bookmarkStart w:id="1880" w:name="Xe6f33f15488280d70f3858ac5d64bf720282e0a"/>
+    <w:bookmarkEnd w:id="1968"/>
+    <w:bookmarkEnd w:id="1969"/>
+    <w:bookmarkStart w:id="1976" w:name="Xe6f33f15488280d70f3858ac5d64bf720282e0a"/>
     <w:p>
       <w:pPr>
         <w:pStyle w:val="Heading1"/>
@@ -4586,7 +4586,7 @@
         <w:t xml:space="preserve">This chapter reviews the work the project builds on, in five themes: paradata within the total survey error framework, response time as a measure of effort, the detection of interviewer falsification, paradata in field and low-resource collection, and outlier detection on skewed data. A sixth and shorter theme covers evaluation on synthetic and imbalanced data. Appendix E records the verification of every source cited here, including those whose pagination or supporting passage still has to be confirmed against a library copy.</w:t>
       </w:r>
     </w:p>
-    <w:bookmarkStart w:id="1874" w:name="Xe79f73605f8f50f9c1f29e234b06c33d383a963"/>
+    <w:bookmarkStart w:id="1970" w:name="Xe79f73605f8f50f9c1f29e234b06c33d383a963"/>
     <w:p>
       <w:pPr>
         <w:pStyle w:val="Heading2"/>
@@ -4619,8 +4619,8 @@
         <w:t xml:space="preserve">Two properties of that description shape this project. The first is that the record is a byproduct. It is produced whether or not anyone analyses it, so using it adds nothing to the cost of fieldwork, which is what makes it attractive where budgets and supervisory capacity are thin. The second is that it records process at the level of individual actions, which means the analyst must decide what to aggregate and how. Those decisions are the feature library described in section 3.2, and they are where most of the methodological choices in this project are made. Kreuter's (2013) edited volume collects the analytic uses that follow once those decisions are taken, across a range of large survey programmes, and its organising distinction, between paradata used to manage collection while it is running and paradata used to analyse quality afterwards, runs through the rest of this chapter. This project sits on the management side: it is designed to flag interviews while the survey is still in the field and something can still be done about them.</w:t>
       </w:r>
     </w:p>
-    <w:bookmarkEnd w:id="1874"/>
-    <w:bookmarkStart w:id="1875" w:name="X64dc8f2e0df703b41ba29c142fc67737e3061d6"/>
+    <w:bookmarkEnd w:id="1970"/>
+    <w:bookmarkStart w:id="1971" w:name="X64dc8f2e0df703b41ba29c142fc67737e3061d6"/>
     <w:p>
       <w:pPr>
         <w:pStyle w:val="Heading2"/>
@@ -4653,8 +4653,8 @@
         <w:t xml:space="preserve">The alternative is a relative definition, in which an interview counts as fast because it is fast compared with the rest of the sample. This project uses both kinds of threshold, and Table 1a says which is which: absolute floors catch physically implausible speed, and median-relative thresholds catch interviews that are out of step with the instrument and population they belong to. Two limits of this literature should be stated. It studies respondents completing web surveys themselves, not enumerators administering interviews in the field, and its thresholds are set per question in a known instrument, whereas an audit log arrives without the questionnaire that produced it. Neither difference removes the underlying argument that unusually fast answers indicate unspent effort, but both mean the constants cannot simply be transplanted.</w:t>
       </w:r>
     </w:p>
-    <w:bookmarkEnd w:id="1875"/>
-    <w:bookmarkStart w:id="1876" w:name="Xe863f4a8a6445523f3a450ecd078397d76cc4da"/>
+    <w:bookmarkEnd w:id="1971"/>
+    <w:bookmarkStart w:id="1972" w:name="Xe863f4a8a6445523f3a450ecd078397d76cc4da"/>
     <w:p>
       <w:pPr>
         <w:pStyle w:val="Heading2"/>
@@ -4695,8 +4695,8 @@
         <w:t xml:space="preserve">Three things follow for this project. The timing signature of fabrication is consistent across this literature: faster, more compressed, less variable. The consensus method is to combine many indicators rather than to trust one. And the strongest results come from supervised classification, which requires labelled fabrication to train on. This project departs on the last point, using transparent univariate rules that need no labels, and section 6.3 reports what that costs.</w:t>
       </w:r>
     </w:p>
-    <w:bookmarkEnd w:id="1876"/>
-    <w:bookmarkStart w:id="1877" w:name="Xf8c0894da6d5fd88199cfba14465555eec9fcf9"/>
+    <w:bookmarkEnd w:id="1972"/>
+    <w:bookmarkStart w:id="1973" w:name="Xf8c0894da6d5fd88199cfba14465555eec9fcf9"/>
     <w:p>
       <w:pPr>
         <w:pStyle w:val="Heading2"/>
@@ -4737,8 +4737,8 @@
         <w:t xml:space="preserve">Three implications follow for the design here, and each is honoured in the implementation. Detection must be explainable to a field supervisor, because a flagged interview leads to a conversation with a named enumerator rather than to a modelling decision, which is why the anomaly score is a count of named flags rather than a model output. Thresholds must be expressible relative to the sample rather than as absolute constants wherever the instrument and the population determine what is normal, which is why the thresholds most likely to depend on context are median-relative and every threshold is configurable (Table 1a). And review capacity is scarce, which is why the precision behaviour at low anomaly prevalence reported in section 6.4 is treated as an operational result rather than as an artefact of the metric.</w:t>
       </w:r>
     </w:p>
-    <w:bookmarkEnd w:id="1877"/>
-    <w:bookmarkStart w:id="1878" w:name="Xc5c63894fe1fcc7bafdf34f7262a65cdb8f2e5d"/>
+    <w:bookmarkEnd w:id="1973"/>
+    <w:bookmarkStart w:id="1974" w:name="Xc5c63894fe1fcc7bafdf34f7262a65cdb8f2e5d"/>
     <w:p>
       <w:pPr>
         <w:pStyle w:val="Heading2"/>
@@ -4779,8 +4779,8 @@
         <w:t xml:space="preserve">The broader anomaly detection literature supplies the vocabulary for what the detector does and does not attempt. Chandola et al. (2009) distinguish data instances described by a single attribute, the univariate case, from those described by several, the multivariate case (§2.1), and note that unsupervised techniques, which require no training data and are therefore the most widely applicable, "make the implicit assumption that normal instances are far more frequent than anomalies in the test data. If this assumption is not true then such techniques suffer from high false alarm rate" (§3). This project violates that assumption deliberately in the prevalence sweep, and the consequence observed in sections 6.3 and 6.6 runs in the opposite direction to the one they describe: because the fences are estimated from the contaminated sample, rising contamination moves the quartiles outwards and costs recall rather than precision. Hodge and Austin (2004) survey the same field from the statistical side and confirm that many classical outlier methods are single-dimensional, and that boxplots are among the tools used on univariate data. Univariate methods of this kind are transparent and interpretable, properties valued in survey quality workflows where a flagged interview must be explainable to a field supervisor, but they cannot detect anomalies visible only in combinations of features. That trade-off is accepted explicitly in the present design and revisited in the results.</w:t>
       </w:r>
     </w:p>
-    <w:bookmarkEnd w:id="1878"/>
-    <w:bookmarkStart w:id="1879" w:name="X49f5bc322e944d00833935fabed4d075fa0c0fd"/>
+    <w:bookmarkEnd w:id="1974"/>
+    <w:bookmarkStart w:id="1975" w:name="X49f5bc322e944d00833935fabed4d075fa0c0fd"/>
     <w:p>
       <w:pPr>
         <w:pStyle w:val="Heading2"/>
@@ -4805,9 +4805,9 @@
         <w:t xml:space="preserve">The nearest precedent in the falsification literature runs the other way, and is instructive about the cost. Birnbaum et al. (2013) obtained labelled fabrication experimentally, by having interviewers conduct real interviews and also fabricate them under controlled conditions, so their labels describe human behaviour rather than a generator's assumptions. That is the stronger design, and the limitation it exposes in this one is stated in section 8: a synthetic evaluation measures a detector against a documented threat model, not against the full range of behaviour a real enumerator might produce.</w:t>
       </w:r>
     </w:p>
-    <w:bookmarkEnd w:id="1879"/>
-    <w:bookmarkEnd w:id="1880"/>
-    <w:bookmarkStart w:id="1887" w:name="Xeaf7af16e3e46fe44e45519dfa10bf831051975"/>
+    <w:bookmarkEnd w:id="1975"/>
+    <w:bookmarkEnd w:id="1976"/>
+    <w:bookmarkStart w:id="1983" w:name="Xeaf7af16e3e46fe44e45519dfa10bf831051975"/>
     <w:p>
       <w:pPr>
         <w:pStyle w:val="Heading1"/>
@@ -4824,7 +4824,7 @@
         <w:t xml:space="preserve">The system is a multi-stage pipeline that proceeds from raw log ingestion through parsing, feature extraction, statistical characterisation and anomaly detection to structured output generation. Development followed an iterative, test-driven approach in Python 3.10 and later versions, using Pandas and NumPy for data processing, SciPy for statistical functions, Matplotlib and Seaborn for visualisation, and Pytest for automated testing (McKinney, 2017).</w:t>
       </w:r>
     </w:p>
-    <w:bookmarkStart w:id="1881" w:name="X1a6881c336449a19663f3eabd2f9d386ab8b4e8"/>
+    <w:bookmarkStart w:id="1977" w:name="X1a6881c336449a19663f3eabd2f9d386ab8b4e8"/>
     <w:p>
       <w:pPr>
         <w:pStyle w:val="Heading2"/>
@@ -4873,8 +4873,8 @@
         <w:t xml:space="preserve">Timestamp handling deserves particular care because it is where real logs most often deviate from documentation. The SurveyCTO parser accepts epoch milliseconds as its canonical input but includes a guard for exports that record epoch seconds, detected from the magnitude of the median value and corrected by rescaling. The ODK parser converts ISO 8601 strings, including timezone offsets, into epoch milliseconds. Both parsers tolerate missing field names, unparseable timestamps and negative durations by marking the affected rows rather than silently accepting or discarding them, so that data problems surface in the quality flags rather than corrupting features. A controller above the parsers performs automatic format detection from column structure and timestamp shape, and can split hybrid files in which rows from both platforms have been concatenated into a single export, a situation that occurs in practice when field teams merge files before upload.</w:t>
       </w:r>
     </w:p>
-    <w:bookmarkEnd w:id="1881"/>
-    <w:bookmarkStart w:id="1882" w:name="X7078ec3f74f83a5c7c92d93b54fe1bdb3e14fbf"/>
+    <w:bookmarkEnd w:id="1977"/>
+    <w:bookmarkStart w:id="1978" w:name="X7078ec3f74f83a5c7c92d93b54fe1bdb3e14fbf"/>
     <w:p>
       <w:pPr>
         <w:pStyle w:val="Heading2"/>
@@ -5165,8 +5165,8 @@
         <w:t xml:space="preserve">Administrative events require care. Real audit logs open and close with form-level rows whose field identifier is blank. These rows contribute to total interview duration but are excluded from question-level and section-level statistics, because treating the gap between form start and form end as a pause would swamp every within-section measure. This exclusion was added after exactly that distortion was observed during validation.</w:t>
       </w:r>
     </w:p>
-    <w:bookmarkEnd w:id="1882"/>
-    <w:bookmarkStart w:id="1883" w:name="Xd7d402944db2221b1d569565a7a9d8862a80537"/>
+    <w:bookmarkEnd w:id="1978"/>
+    <w:bookmarkStart w:id="1979" w:name="Xd7d402944db2221b1d569565a7a9d8862a80537"/>
     <w:p>
       <w:pPr>
         <w:pStyle w:val="Heading2"/>
@@ -5199,8 +5199,8 @@
         <w:t xml:space="preserve">Outlier fences follow Tukey's construction. For a given feature the interquartile range is the distance between the first and third quartiles, and values falling more than one and a half times that distance outside either quartile are flagged. The construction uses only order statistics, so it makes no distributional assumption and is itself insensitive to the outliers it identifies, which is essential for right-skewed response time data where a z-score approach would let extreme values distort their own detection threshold (Iglewicz and Hoaglin, 1993).</w:t>
       </w:r>
     </w:p>
-    <w:bookmarkEnd w:id="1883"/>
-    <w:bookmarkStart w:id="1884" w:name="X205cfb61f9cb3d70cd95ef2fa0e91992ab3ea43"/>
+    <w:bookmarkEnd w:id="1979"/>
+    <w:bookmarkStart w:id="1980" w:name="X205cfb61f9cb3d70cd95ef2fa0e91992ab3ea43"/>
     <w:p>
       <w:pPr>
         <w:pStyle w:val="Heading2"/>
@@ -6376,8 +6376,8 @@
         <w:t xml:space="preserve">is provided, not estimates of an optimal threshold. A separate set of data quality flags, covering impossible values such as negative durations or a maximum below a minimum, routes technically corrupt records into their own category so that device faults are not misread as behavioural anomalies. The score is a transparent count: every flagged interview can be explained by listing its active flags, which is a requirement for use in field supervision.</w:t>
       </w:r>
     </w:p>
-    <w:bookmarkEnd w:id="1884"/>
-    <w:bookmarkStart w:id="1885" w:name="X421e64b334c4d0b0a8ef42727ff9bdff5d3fc24"/>
+    <w:bookmarkEnd w:id="1980"/>
+    <w:bookmarkStart w:id="1981" w:name="X421e64b334c4d0b0a8ef42727ff9bdff5d3fc24"/>
     <w:p>
       <w:pPr>
         <w:pStyle w:val="Heading2"/>
@@ -6394,8 +6394,8 @@
         <w:t xml:space="preserve">The pipeline was designed for datasets ranging from pilot studies of a few dozen interviews to national surveys of tens of thousands. Feature extraction uses vectorised Pandas operations whose cost grows approximately linearly with the number of audit events per interview, and anomaly detection is dominated by quantile computation over interviews. Files are processed one at a time, but the batch path keeps the question-level and section-level tables for every interview until they are written out, so memory grows linearly with the number of interviews; section 6.7 reports the measured peak.</w:t>
       </w:r>
     </w:p>
-    <w:bookmarkEnd w:id="1885"/>
-    <w:bookmarkStart w:id="1886" w:name="X101ea5584931976fea3eeef061f35847bc68122"/>
+    <w:bookmarkEnd w:id="1981"/>
+    <w:bookmarkStart w:id="1982" w:name="X101ea5584931976fea3eeef061f35847bc68122"/>
     <w:p>
       <w:pPr>
         <w:pStyle w:val="Heading2"/>
@@ -6453,9 +6453,9 @@
         <w:t xml:space="preserve">.</w:t>
       </w:r>
     </w:p>
-    <w:bookmarkEnd w:id="1886"/>
-    <w:bookmarkEnd w:id="1887"/>
-    <w:bookmarkStart w:id="1891" w:name="X61180d00ca5ad1a465e60a25e0f8019543cae99"/>
+    <w:bookmarkEnd w:id="1982"/>
+    <w:bookmarkEnd w:id="1983"/>
+    <w:bookmarkStart w:id="1987" w:name="X61180d00ca5ad1a465e60a25e0f8019543cae99"/>
     <w:p>
       <w:pPr>
         <w:pStyle w:val="Heading1"/>
@@ -6481,18 +6481,18 @@
           <wp:inline>
             <wp:extent cx="5943600" cy="4738816"/>
             <wp:effectExtent b="0" l="0" r="0" t="0"/>
-            <wp:docPr descr="Five-layer pipeline architecture" title="" id="1889" name="Picture"/>
+            <wp:docPr descr="Five-layer pipeline architecture" title="" id="1985" name="Picture"/>
             <a:graphic>
               <a:graphicData uri="http://schemas.openxmlformats.org/drawingml/2006/picture">
                 <pic:pic>
                   <pic:nvPicPr>
-                    <pic:cNvPr descr="figures/figure1_architecture.png" id="1890" name="Picture"/>
+                    <pic:cNvPr descr="figures/figure1_architecture.png" id="1986" name="Picture"/>
                     <pic:cNvPicPr>
                       <a:picLocks noChangeArrowheads="1" noChangeAspect="1"/>
                     </pic:cNvPicPr>
                   </pic:nvPicPr>
                   <pic:blipFill>
-                    <a:blip r:embed="rId1888"/>
+                    <a:blip r:embed="rId1984"/>
                     <a:stretch>
                       <a:fillRect/>
                     </a:stretch>
@@ -6625,8 +6625,8 @@
         <w:t xml:space="preserve">). The first three were added during revision. In the version first submitted, the ODK placeholder and administrative-event fixes had no test, and the statement that all five fixes were covered was wrong. Three further tests were added at the same time: one confirming that the fence multiplier is configurable, one confirming that a single generated history parses identically from both formats (section 6.5), and one confirming that a log in ODK's documented native layout is detected and its form-level events excluded from the section statistics (section 3.1).</w:t>
       </w:r>
     </w:p>
-    <w:bookmarkEnd w:id="1891"/>
-    <w:bookmarkStart w:id="1896" w:name="Xa467df6a0675b11971eb708fc8af2b16a422a62"/>
+    <w:bookmarkEnd w:id="1987"/>
+    <w:bookmarkStart w:id="1992" w:name="Xa467df6a0675b11971eb708fc8af2b16a422a62"/>
     <w:p>
       <w:pPr>
         <w:pStyle w:val="Heading1"/>
@@ -6635,7 +6635,7 @@
         <w:t xml:space="preserve">5. Evaluation Methodology</w:t>
       </w:r>
     </w:p>
-    <w:bookmarkStart w:id="1892" w:name="X95e8a362243b2b637a1c1398686c766abe4ae05"/>
+    <w:bookmarkStart w:id="1988" w:name="X95e8a362243b2b637a1c1398686c766abe4ae05"/>
     <w:p>
       <w:pPr>
         <w:pStyle w:val="Heading2"/>
@@ -7445,8 +7445,8 @@
         <w:t xml:space="preserve">Genuine interviews also receive Poisson(0.6) constraint errors lasting U[800, 4,000) ms. Each interview opens with a form-start row lasting U[400, 2,500) ms and closes with a form-end row lasting U[200, 1,500) ms, each jump row lasts 300 ms, and benchmark interviews start ten minutes apart. Anomalous interviews are split equally between fabricated and speeding, with the remainder disengaged, so 100 anomalies become 33, 33 and 34.</w:t>
       </w:r>
     </w:p>
-    <w:bookmarkEnd w:id="1892"/>
-    <w:bookmarkStart w:id="1893" w:name="X7a5f514c6929509fe504fc0972649723333ba84"/>
+    <w:bookmarkEnd w:id="1988"/>
+    <w:bookmarkStart w:id="1989" w:name="X7a5f514c6929509fe504fc0972649723333ba84"/>
     <w:p>
       <w:pPr>
         <w:pStyle w:val="Heading2"/>
@@ -7471,8 +7471,8 @@
         <w:t xml:space="preserve">One risk these safeguards cannot remove is that the generator and the detector share an author. The anomaly profiles in Table 1b encode my reading of what fabrication, speeding and disengagement look like, and the rules in Table 1a encode the same reading, so a high score measures agreement between two expressions of one set of assumptions as much as it measures the detector's ability to find anomalies in field data. Held-out seeds guard against fitting to particular random draws, not against this shared construct, and the stress condition narrows the gap only by making the profiles overlap. The results should therefore be read as evidence that the detector recognises the threat model the generator documents. Section 8 returns to what this implies.</w:t>
       </w:r>
     </w:p>
-    <w:bookmarkEnd w:id="1893"/>
-    <w:bookmarkStart w:id="1894" w:name="X78454523fe4718ec508b1ebc3db8610d19d4586"/>
+    <w:bookmarkEnd w:id="1989"/>
+    <w:bookmarkStart w:id="1990" w:name="X78454523fe4718ec508b1ebc3db8610d19d4586"/>
     <w:p>
       <w:pPr>
         <w:pStyle w:val="Heading2"/>
@@ -7489,8 +7489,8 @@
         <w:t xml:space="preserve">Four kinds of dataset were used. A canonical suite of twenty-four interviews, twelve per platform format, pairs each anomaly profile with known expected outcomes and serves as a fixed regression test. Benchmark datasets of one hundred and twenty to ten thousand interviews at twenty percent anomaly prevalence exercise scale in both formats. The imbalance sweep holds size at five hundred interviews and varies prevalence across five, ten, twenty and thirty percent. The stress datasets, five hundred interviews each from two held-out seeds and rendered in both formats, provide the overlapping-profile condition. For the platform comparison in section 6.5, the canonical n500 benchmark and both stress datasets were also regenerated with a single history written into both formats. Ground truth for every dataset records each interview's profile and binary anomaly status, and the evaluation join verifies that predictions cover the ground truth exactly.</w:t>
       </w:r>
     </w:p>
-    <w:bookmarkEnd w:id="1894"/>
-    <w:bookmarkStart w:id="1895" w:name="X1a00132c716f917778617e30a0d3d84720dcc98"/>
+    <w:bookmarkEnd w:id="1990"/>
+    <w:bookmarkStart w:id="1991" w:name="X1a00132c716f917778617e30a0d3d84720dcc98"/>
     <w:p>
       <w:pPr>
         <w:pStyle w:val="Heading2"/>
@@ -7507,9 +7507,9 @@
         <w:t xml:space="preserve">Primary metrics are precision, the proportion of flagged interviews that are truly anomalous, and recall, the proportion of truly anomalous interviews that are flagged, with the F1 score as their harmonic mean. Success criteria were fixed at proposal stage: precision at or above 0.80 and recall at or above 0.75. Feature-level validity is assessed with Mann-Whitney U tests comparing each feature between normal and anomalous interviews, with effect sizes reported. The full detector is compared against two baselines representing current practice: a duration-only method that flags interviews solely on total duration outside the Tukey fences, and a single-rule method, V-10, that flags every interview whose log contains a run of twenty or more consecutive events with no back or jump event. The first submission described this baseline as flagging interviews with zero back-navigation. That was wrong: an interview with one early jump followed by twenty uninterrupted events is also flagged, and zero back-navigation is a different feature, V-06 = 0.</w:t>
       </w:r>
     </w:p>
-    <w:bookmarkEnd w:id="1895"/>
-    <w:bookmarkEnd w:id="1896"/>
-    <w:bookmarkStart w:id="1907" w:name="Xb84024f831f54dd6cf41fa7512b2dfdd301b0cb"/>
+    <w:bookmarkEnd w:id="1991"/>
+    <w:bookmarkEnd w:id="1992"/>
+    <w:bookmarkStart w:id="2003" w:name="Xb84024f831f54dd6cf41fa7512b2dfdd301b0cb"/>
     <w:p>
       <w:pPr>
         <w:pStyle w:val="Heading1"/>
@@ -7518,7 +7518,7 @@
         <w:t xml:space="preserve">6. Results</w:t>
       </w:r>
     </w:p>
-    <w:bookmarkStart w:id="1897" w:name="Xc60dd8635c4341530214a6cf66ebcf4b2565b4b"/>
+    <w:bookmarkStart w:id="1993" w:name="Xc60dd8635c4341530214a6cf66ebcf4b2565b4b"/>
     <w:p>
       <w:pPr>
         <w:pStyle w:val="Heading2"/>
@@ -7535,8 +7535,8 @@
         <w:t xml:space="preserve">On the canonical suite of twenty-four interviews, twenty were assigned their expected category. Genuine interviews scored one flag each and were categorised normal, fabricated interviews scored five or six and were categorised anomalous, disengaged interviews scored two or three and were categorised suspicious as expected, and the six degenerate records were routed to the data quality category rather than scored behaviourally. The four speeding interviews, two per format, did not reach their expected category: the generator labels speeding as anomalous, but they scored three or four and were categorised suspicious. They were still flagged, so binary precision and recall on the suite are both 1.0000, but the severity band understates speeding in this suite. The first submission's statement that every interview was assigned its expected category was wrong.</w:t>
       </w:r>
     </w:p>
-    <w:bookmarkEnd w:id="1897"/>
-    <w:bookmarkStart w:id="1898" w:name="Xb4e27ebbc2b79a48764b21a9ecc308da8d54b06"/>
+    <w:bookmarkEnd w:id="1993"/>
+    <w:bookmarkStart w:id="1994" w:name="Xb4e27ebbc2b79a48764b21a9ecc308da8d54b06"/>
     <w:p>
       <w:pPr>
         <w:pStyle w:val="Heading2"/>
@@ -8276,8 +8276,8 @@
         <w:t xml:space="preserve">.</w:t>
       </w:r>
     </w:p>
-    <w:bookmarkEnd w:id="1898"/>
-    <w:bookmarkStart w:id="1899" w:name="X5cd39e557e89a9d2d2c686de2b622b3c1b8ee2c"/>
+    <w:bookmarkEnd w:id="1994"/>
+    <w:bookmarkStart w:id="1995" w:name="X5cd39e557e89a9d2d2c686de2b622b3c1b8ee2c"/>
     <w:p>
       <w:pPr>
         <w:pStyle w:val="Heading2"/>
@@ -9031,8 +9031,8 @@
         <w:t xml:space="preserve">The practical reading is that the rules, grounded directly in the behavioural signatures documented in the literature, do the heavy lifting, while the statistical component contributes marginal gains in conditions where class separation is already wide. Full per-run values, including confusion counts for each component, are regenerated by the command in Appendix D.4.</w:t>
       </w:r>
     </w:p>
-    <w:bookmarkEnd w:id="1899"/>
-    <w:bookmarkStart w:id="1903" w:name="X5a499f93a88a5b6c771a2b9ca133fa68f3df142"/>
+    <w:bookmarkEnd w:id="1995"/>
+    <w:bookmarkStart w:id="1999" w:name="X5a499f93a88a5b6c771a2b9ca133fa68f3df142"/>
     <w:p>
       <w:pPr>
         <w:pStyle w:val="Heading2"/>
@@ -9379,18 +9379,18 @@
           <wp:inline>
             <wp:extent cx="5943600" cy="3460252"/>
             <wp:effectExtent b="0" l="0" r="0" t="0"/>
-            <wp:docPr descr="Precision and recall against anomaly prevalence" title="" id="1901" name="Picture"/>
+            <wp:docPr descr="Precision and recall against anomaly prevalence" title="" id="1997" name="Picture"/>
             <a:graphic>
               <a:graphicData uri="http://schemas.openxmlformats.org/drawingml/2006/picture">
                 <pic:pic>
                   <pic:nvPicPr>
-                    <pic:cNvPr descr="figures/figure2_prevalence.png" id="1902" name="Picture"/>
+                    <pic:cNvPr descr="figures/figure2_prevalence.png" id="1998" name="Picture"/>
                     <pic:cNvPicPr>
                       <a:picLocks noChangeArrowheads="1" noChangeAspect="1"/>
                     </pic:cNvPicPr>
                   </pic:nvPicPr>
                   <pic:blipFill>
-                    <a:blip r:embed="rId1900"/>
+                    <a:blip r:embed="rId1996"/>
                     <a:stretch>
                       <a:fillRect/>
                     </a:stretch>
@@ -9446,8 +9446,8 @@
         <w:t xml:space="preserve">At five percent prevalence a single genuine interview was falsely flagged, costing almost four points of precision. This sensitivity of precision to prevalence is a property of the metric rather than of the detector, and it matters operationally because real fabrication rates are usually low. On this sweep the detector raised one false alarm in 500 interviews at five percent prevalence. That is a single observation on generated data, not an estimate of field review burden, and section 7 treats it as a hypothesis for a field pilot to test.</w:t>
       </w:r>
     </w:p>
-    <w:bookmarkEnd w:id="1903"/>
-    <w:bookmarkStart w:id="1904" w:name="X79f15269978cc056a5dc22d6babb1771a27c953"/>
+    <w:bookmarkEnd w:id="1999"/>
+    <w:bookmarkStart w:id="2000" w:name="X79f15269978cc056a5dc22d6babb1771a27c953"/>
     <w:p>
       <w:pPr>
         <w:pStyle w:val="Heading2"/>
@@ -10570,8 +10570,8 @@
         <w:t xml:space="preserve">On matched histories the two parsers produce identical features, scores and categories for all 1,500 interviews, and therefore identical confusion counts. This is the evidence for the common intermediate representation, and it is stronger than the original claim, because it shows equivalence interview by interview rather than similarity in aggregate. It also accounts for the differences between the SurveyCTO and ODK rows of Table 6 and Appendix B.2: they are differences between the sampled interviews, not between the parsers. The equivalence holds for the two synthetic formats; section 3.1 explains why it does not yet extend to native exports.</w:t>
       </w:r>
     </w:p>
-    <w:bookmarkEnd w:id="1904"/>
-    <w:bookmarkStart w:id="1905" w:name="X6bb093455b84248a911faa32a04547a0cb342ce"/>
+    <w:bookmarkEnd w:id="2000"/>
+    <w:bookmarkStart w:id="2001" w:name="X6bb093455b84248a911faa32a04547a0cb342ce"/>
     <w:p>
       <w:pPr>
         <w:pStyle w:val="Heading2"/>
@@ -11040,8 +11040,8 @@
         <w:t xml:space="preserve">beside it. The absolute entropy rule does not fire, at 1.236 bits against 0.5, nor does uniform timing, at a coefficient of variation of 0.14 against 0.1, and the interview contains one jump, so the navigation rule is silent. Each of the three flags that did fire cleared its threshold by less than five percent, which is what a per-class recall of 0.70 looks like at the level of a single interview. The two false positives in the same run, INT-00287 and INT-00341, each scored exactly two, from moderate back-navigation and the variance fence, which is a flag pair a supervisor reading the listed flags could weigh quickly.</w:t>
       </w:r>
     </w:p>
-    <w:bookmarkEnd w:id="1905"/>
-    <w:bookmarkStart w:id="1906" w:name="X87018f94b260bafc12e37c04ea7f6327e072c62"/>
+    <w:bookmarkEnd w:id="2001"/>
+    <w:bookmarkStart w:id="2002" w:name="X87018f94b260bafc12e37c04ea7f6327e072c62"/>
     <w:p>
       <w:pPr>
         <w:pStyle w:val="Heading2"/>
@@ -12003,9 +12003,9 @@
         <w:t xml:space="preserve">After all changes made during the robustness round, the canonical benchmark suite continued to score precision 1.0000 and recall 1.0000 in both platform formats, confirming that hardening the evaluation did not degrade performance on the original success cases, and the automated test suite, now forty-three tests, passed in full.</w:t>
       </w:r>
     </w:p>
-    <w:bookmarkEnd w:id="1906"/>
-    <w:bookmarkEnd w:id="1907"/>
-    <w:bookmarkStart w:id="1908" w:name="Xaa41b10cc6ea992ae291d3c205d2ba26cb494fd"/>
+    <w:bookmarkEnd w:id="2002"/>
+    <w:bookmarkEnd w:id="2003"/>
+    <w:bookmarkStart w:id="2004" w:name="Xaa41b10cc6ea992ae291d3c205d2ba26cb494fd"/>
     <w:p>
       <w:pPr>
         <w:pStyle w:val="Heading1"/>
@@ -12086,8 +12086,8 @@
         <w:t xml:space="preserve">Because a flag concerns a named enumerator's work, a deployment would also need a documented process for adjudicating and challenging flags. A flag should open a review, never conclude one. The supervisor sees the listed flags and their values against the thresholds, as in the worked example in section 6.6, and checks them against independent evidence such as a back-check visit or, where available, GPS or audio audit. The enumerator should be told which signals fired and given the chance to explain them, since long pauses, fast but valid respondents and an absence of navigation all have innocent causes. The outcome should be recorded, so that rules which repeatedly fire on interviews later found to be genuine can be recalibrated, and no decision about an enumerator's employment should rest on the score alone. The per-flag reporting also supports feedback to enumerators, since a pattern of speeding flags concentrated in one team is actionable in a way that a bare quality score is not.</w:t>
       </w:r>
     </w:p>
-    <w:bookmarkEnd w:id="1908"/>
-    <w:bookmarkStart w:id="1909" w:name="Xff68836fd6338b1e475ce903f71a94c825ab87e"/>
+    <w:bookmarkEnd w:id="2004"/>
+    <w:bookmarkStart w:id="2005" w:name="Xff68836fd6338b1e475ce903f71a94c825ab87e"/>
     <w:p>
       <w:pPr>
         <w:pStyle w:val="Heading1"/>
@@ -12222,8 +12222,8 @@
         <w:t xml:space="preserve">The pipeline depends on the integrity of device clocks and on each platform continuing to emit its current audit schema. Clock drift or schema changes would degrade timestamps or parsing respectively; the parsers detect and mark such records rather than repair them, so the failure is visible in the quality flags rather than silent in the features.</w:t>
       </w:r>
     </w:p>
-    <w:bookmarkEnd w:id="1909"/>
-    <w:bookmarkStart w:id="1911" w:name="Xf084a3aad2ba019113a3f84a3b857d0628c92ce"/>
+    <w:bookmarkEnd w:id="2005"/>
+    <w:bookmarkStart w:id="2007" w:name="Xf084a3aad2ba019113a3f84a3b857d0628c92ce"/>
     <w:p>
       <w:pPr>
         <w:pStyle w:val="Heading1"/>
@@ -12240,7 +12240,7 @@
         <w:t xml:space="preserve">This project set out to make timing-based paradata usable for survey quality assurance at scale, and delivered a working system: format-aware parsers for the two dominant collection platforms, a documented forty-feature library spanning three levels of granularity and a statistical characterisation layer, a transparent and configurable anomaly detector, a labelled synthetic benchmark generator, and an evaluation that meets its predefined success criteria under deliberately hostile conditions. Precision remained between 0.96 and 1.00 and recall between 0.84 and 1.00 on data the detector had never seen, including a stress condition constructed to blur the line between genuine and anomalous behaviour. The system detects speeding essentially perfectly, disengagement reliably, and blatant fabrication reliably. Mild fabrication is detected in roughly seven cases in ten, and the diagnostic reported here locates that shortfall in threshold calibration rather than in the univariate design itself, which makes it a tractable target rather than a boundary. Five of the six objectives set at proposal stage are met in full. The second, format-aware parsers for SurveyCTO and ODK, is met for the two synthetic formats evaluated here and only in part for the platforms' native exports (section 3.1). Future work should validate the parsers on native exports and the system against real field data with verified outcomes, settle the entropy fence trade-off against operational evidence of relative error costs rather than synthetic prevalence alone, extend detection with an interpretable multivariate layer, and add parsers for further platforms, each of which the architecture was explicitly designed to accommodate.</w:t>
       </w:r>
     </w:p>
-    <w:bookmarkStart w:id="1910" w:name="Xc6172d26bdd853bf5a184bec07518863c919061"/>
+    <w:bookmarkStart w:id="2006" w:name="Xc6172d26bdd853bf5a184bec07518863c919061"/>
     <w:p>
       <w:pPr>
         <w:pStyle w:val="Heading2"/>
@@ -12281,9 +12281,9 @@
         <w:t xml:space="preserve">The third is about sources, and it is not comfortable. Two of the references in my first submission could not be located, and they carried some of the claims I leaned on most heavily. Losing them cost me the fabrication signature, the disengagement signature and seventeen of the forty feature justifications, and it taught me that a citation is a claim about a document that either exists and says what I attribute to it, or does not. I now check every reference against its primary source, record the check with a date, and treat a source I have not read myself as unusable. With the time again I would keep that record from the first week rather than reconstructing it at the end, and I would log every use of an AI tool as it happened, for the same reason: a record made afterwards is weaker evidence than one made at the time.</w:t>
       </w:r>
     </w:p>
-    <w:bookmarkEnd w:id="1910"/>
-    <w:bookmarkEnd w:id="1911"/>
-    <w:bookmarkStart w:id="1917" w:name="references"/>
+    <w:bookmarkEnd w:id="2006"/>
+    <w:bookmarkEnd w:id="2007"/>
+    <w:bookmarkStart w:id="2013" w:name="references"/>
     <w:p>
       <w:pPr>
         <w:pStyle w:val="Heading1"/>
@@ -12390,7 +12390,7 @@
       <w:r>
         <w:t xml:space="preserve"> </w:t>
       </w:r>
-      <w:hyperlink r:id="rId1912">
+      <w:hyperlink r:id="rId2008">
         <w:r>
           <w:rPr>
             <w:rStyle w:val="Hyperlink"/>
@@ -12497,7 +12497,7 @@
       <w:r>
         <w:t xml:space="preserve"> </w:t>
       </w:r>
-      <w:hyperlink r:id="rId1913">
+      <w:hyperlink r:id="rId2009">
         <w:r>
           <w:rPr>
             <w:rStyle w:val="Hyperlink"/>
@@ -12868,7 +12868,7 @@
       <w:r>
         <w:t xml:space="preserve"> </w:t>
       </w:r>
-      <w:hyperlink r:id="rId1914">
+      <w:hyperlink r:id="rId2010">
         <w:r>
           <w:rPr>
             <w:rStyle w:val="Hyperlink"/>
@@ -12933,7 +12933,7 @@
       <w:r>
         <w:t xml:space="preserve"> </w:t>
       </w:r>
-      <w:hyperlink r:id="rId1915">
+      <w:hyperlink r:id="rId2011">
         <w:r>
           <w:rPr>
             <w:rStyle w:val="Hyperlink"/>
@@ -12974,7 +12974,7 @@
       <w:r>
         <w:t xml:space="preserve"> </w:t>
       </w:r>
-      <w:hyperlink r:id="rId1916">
+      <w:hyperlink r:id="rId2012">
         <w:r>
           <w:rPr>
             <w:rStyle w:val="Hyperlink"/>
@@ -13068,8 +13068,8 @@
         </w:pict>
       </w:r>
     </w:p>
-    <w:bookmarkEnd w:id="1917"/>
-    <w:bookmarkStart w:id="1925" w:name="X037053293eb9ad08c241ce36f243ee7ade64cd4"/>
+    <w:bookmarkEnd w:id="2013"/>
+    <w:bookmarkStart w:id="2021" w:name="X037053293eb9ad08c241ce36f243ee7ade64cd4"/>
     <w:p>
       <w:pPr>
         <w:pStyle w:val="Heading1"/>
@@ -13078,7 +13078,7 @@
         <w:t xml:space="preserve">Appendix A. Artificial intelligence usage disclosure</w:t>
       </w:r>
     </w:p>
-    <w:bookmarkStart w:id="1918" w:name="a1-purpose-and-scope"/>
+    <w:bookmarkStart w:id="2014" w:name="a1-purpose-and-scope"/>
     <w:p>
       <w:pPr>
         <w:pStyle w:val="Heading2"/>
@@ -13130,8 +13130,8 @@
         <w:t xml:space="preserve">, the synthetic generator and its anomaly profiles, the success criteria, the interpretation of every result, and the decision to report weaker per-class results transparently are mine.</w:t>
       </w:r>
     </w:p>
-    <w:bookmarkEnd w:id="1918"/>
-    <w:bookmarkStart w:id="1919" w:name="Xefcbccbece08c31672fc51a6545a71ea5270a53"/>
+    <w:bookmarkEnd w:id="2014"/>
+    <w:bookmarkStart w:id="2015" w:name="Xefcbccbece08c31672fc51a6545a71ea5270a53"/>
     <w:p>
       <w:pPr>
         <w:pStyle w:val="Heading2"/>
@@ -13460,8 +13460,8 @@
         </w:tc>
       </w:tr>
     </w:tbl>
-    <w:bookmarkEnd w:id="1919"/>
-    <w:bookmarkStart w:id="1920" w:name="a3-tools-and-versions"/>
+    <w:bookmarkEnd w:id="2015"/>
+    <w:bookmarkStart w:id="2016" w:name="a3-tools-and-versions"/>
     <w:p>
       <w:pPr>
         <w:pStyle w:val="Heading2"/>
@@ -13914,8 +13914,8 @@
         <w:t xml:space="preserve">The last three rows are not AI tools and are listed because the reproducibility of every figure in this report depends on them, and because two of the five defects recorded in section 4 were caused by a pandas version change rather than by a logic error.</w:t>
       </w:r>
     </w:p>
-    <w:bookmarkEnd w:id="1920"/>
-    <w:bookmarkStart w:id="1921" w:name="a4-log-of-use-by-episode"/>
+    <w:bookmarkEnd w:id="2016"/>
+    <w:bookmarkStart w:id="2017" w:name="a4-log-of-use-by-episode"/>
     <w:p>
       <w:pPr>
         <w:pStyle w:val="Heading2"/>
@@ -15426,8 +15426,8 @@
         </w:tc>
       </w:tr>
     </w:tbl>
-    <w:bookmarkEnd w:id="1921"/>
-    <w:bookmarkStart w:id="1922" w:name="a5-the-decisions-that-mattered"/>
+    <w:bookmarkEnd w:id="2017"/>
+    <w:bookmarkStart w:id="2018" w:name="a5-the-decisions-that-mattered"/>
     <w:p>
       <w:pPr>
         <w:pStyle w:val="Heading2"/>
@@ -15585,8 +15585,8 @@
         <w:t xml:space="preserve">, so it cannot be merged by fast forward and is preserved as a separate line of development. Its code comment claimed that the correction reduces to Tukey's fence for a symmetric distribution; that is wrong, for the reason given in section 7, and the comment has been corrected. The correction is a lower-side analogue of the semi-interquartile fence documented by Hubert and Vandervieren (2008, §1), which is discussed in section 2.5.</w:t>
       </w:r>
     </w:p>
-    <w:bookmarkEnd w:id="1922"/>
-    <w:bookmarkStart w:id="1923" w:name="a6-tests-attached-to-significant-outputs"/>
+    <w:bookmarkEnd w:id="2018"/>
+    <w:bookmarkStart w:id="2019" w:name="a6-tests-attached-to-significant-outputs"/>
     <w:p>
       <w:pPr>
         <w:pStyle w:val="Heading2"/>
@@ -15630,8 +15630,8 @@
         <w:t xml:space="preserve">rather than maintained by hand, so it cannot drift from the code. The component breakdown in section 6.3 is recomputed from recorded predictions rather than from a fresh run, so it describes exactly the runs reported elsewhere in this report.</w:t>
       </w:r>
     </w:p>
-    <w:bookmarkEnd w:id="1923"/>
-    <w:bookmarkStart w:id="1924" w:name="a7-limitations-of-this-disclosure"/>
+    <w:bookmarkEnd w:id="2019"/>
+    <w:bookmarkStart w:id="2020" w:name="a7-limitations-of-this-disclosure"/>
     <w:p>
       <w:pPr>
         <w:pStyle w:val="Heading2"/>
@@ -15655,9 +15655,9 @@
         </w:pict>
       </w:r>
     </w:p>
-    <w:bookmarkEnd w:id="1924"/>
-    <w:bookmarkEnd w:id="1925"/>
-    <w:bookmarkStart w:id="1928" w:name="appendix-b-per-run-confusion-counts"/>
+    <w:bookmarkEnd w:id="2020"/>
+    <w:bookmarkEnd w:id="2021"/>
+    <w:bookmarkStart w:id="2024" w:name="appendix-b-per-run-confusion-counts"/>
     <w:p>
       <w:pPr>
         <w:pStyle w:val="Heading1"/>
@@ -15674,7 +15674,7 @@
         <w:t xml:space="preserve">These are the raw counts behind every precision and recall figure in section 6. They cover the ten runs of the robustness round: two canonical benchmarks, four held-out stress runs, and four prevalence sweep runs.</w:t>
       </w:r>
     </w:p>
-    <w:bookmarkStart w:id="1926" w:name="b1-per-run"/>
+    <w:bookmarkStart w:id="2022" w:name="b1-per-run"/>
     <w:p>
       <w:pPr>
         <w:pStyle w:val="Heading2"/>
@@ -17442,8 +17442,8 @@
         <w:t xml:space="preserve">The lowest single precision anywhere in the round is 0.9570, on seed 7 in ODK format at stress difficulty. The lowest single recall is 0.8400, on seed 99 in ODK format. Both clear the proposal criteria of 0.80 and 0.75.</w:t>
       </w:r>
     </w:p>
-    <w:bookmarkEnd w:id="1926"/>
-    <w:bookmarkStart w:id="1927" w:name="b2-aggregated-by-platform-format"/>
+    <w:bookmarkEnd w:id="2022"/>
+    <w:bookmarkStart w:id="2023" w:name="b2-aggregated-by-platform-format"/>
     <w:p>
       <w:pPr>
         <w:pStyle w:val="Heading2"/>
@@ -17833,9 +17833,9 @@
         </w:pict>
       </w:r>
     </w:p>
-    <w:bookmarkEnd w:id="1927"/>
-    <w:bookmarkEnd w:id="1928"/>
-    <w:bookmarkStart w:id="1929" w:name="appendix-c-full-feature-validity-results"/>
+    <w:bookmarkEnd w:id="2023"/>
+    <w:bookmarkEnd w:id="2024"/>
+    <w:bookmarkStart w:id="2025" w:name="appendix-c-full-feature-validity-results"/>
     <w:p>
       <w:pPr>
         <w:pStyle w:val="Heading1"/>
@@ -21006,8 +21006,8 @@
         </w:pict>
       </w:r>
     </w:p>
-    <w:bookmarkEnd w:id="1929"/>
-    <w:bookmarkStart w:id="1944" w:name="appendix-d-reproduction-commands"/>
+    <w:bookmarkEnd w:id="2025"/>
+    <w:bookmarkStart w:id="2040" w:name="appendix-d-reproduction-commands"/>
     <w:p>
       <w:pPr>
         <w:pStyle w:val="Heading1"/>
@@ -21105,10 +21105,22 @@
         <w:t xml:space="preserve">requirements-validated.txt</w:t>
       </w:r>
       <w:r>
-        <w:t xml:space="preserve">). Every step passed except the full workflow, which failed because the n10000 pack did not yet exist; the order above corrects that. Every recorded confusion count reproduced exactly, as did the component, baseline and parity tables, and the feature validity values agreed to within 6 × 10⁻¹⁶. D.11 was not run, because it requires Microsoft Word. [[TO DO: repeat the run from the final release tag and record it here.]]</w:t>
-      </w:r>
-    </w:p>
-    <w:bookmarkStart w:id="1930" w:name="d1-environment"/>
+        <w:t xml:space="preserve">). Every step passed except the full workflow, which failed because the n10000 pack did not yet exist; the order above corrects that. Every recorded confusion count reproduced exactly, as did the component, baseline and parity tables, and the feature validity values agreed to within 6 × 10⁻¹⁶. D.11 was not run there, because it requires Microsoft Word. The sequence was then run again on 16 September 2026 from a clean clone of the tagged tree, at commit</w:t>
+      </w:r>
+      <w:r>
+        <w:t xml:space="preserve"> </w:t>
+      </w:r>
+      <w:r>
+        <w:rPr>
+          <w:rStyle w:val="VerbatimChar"/>
+        </w:rPr>
+        <w:t xml:space="preserve">a432441</w:t>
+      </w:r>
+      <w:r>
+        <w:t xml:space="preserve">, which differs from the tag only in the rebuilt Word and PDF deliverables and in the page numbers measured into the contents lists. All fourteen steps passed, in one hour and fifty-three minutes, and every recorded number reproduced with no mismatches: the confusion counts of all ten runs of the robustness round, the component breakdown, the baseline table, the parity metrics and summary, and precision and recall of 1.0000 on the canonical suite. The feature validity values agreed to within 6 x 10^-16, the residual difference being the pandas version. D.11 was run on the submission machine and produced the Word and PDF deliverables that accompany this report.</w:t>
+      </w:r>
+    </w:p>
+    <w:bookmarkStart w:id="2026" w:name="d1-environment"/>
     <w:p>
       <w:pPr>
         <w:pStyle w:val="Heading2"/>
@@ -21190,8 +21202,8 @@
         <w:t xml:space="preserve">, so the same file installs on Linux and macOS.</w:t>
       </w:r>
     </w:p>
-    <w:bookmarkEnd w:id="1930"/>
-    <w:bookmarkStart w:id="1931" w:name="d2-test-suite"/>
+    <w:bookmarkEnd w:id="2026"/>
+    <w:bookmarkStart w:id="2027" w:name="d2-test-suite"/>
     <w:p>
       <w:pPr>
         <w:pStyle w:val="Heading2"/>
@@ -21243,8 +21255,8 @@
         <w:t xml:space="preserve">Expected: 43 passed.</w:t>
       </w:r>
     </w:p>
-    <w:bookmarkEnd w:id="1931"/>
-    <w:bookmarkStart w:id="1932" w:name="d3-the-authoritative-robustness-round"/>
+    <w:bookmarkEnd w:id="2027"/>
+    <w:bookmarkStart w:id="2028" w:name="d3-the-authoritative-robustness-round"/>
     <w:p>
       <w:pPr>
         <w:pStyle w:val="Heading2"/>
@@ -21278,8 +21290,8 @@
         <w:t xml:space="preserve"> scripts/run_robustness_validation.py</w:t>
       </w:r>
     </w:p>
-    <w:bookmarkEnd w:id="1932"/>
-    <w:bookmarkStart w:id="1933" w:name="d4-component-breakdown"/>
+    <w:bookmarkEnd w:id="2028"/>
+    <w:bookmarkStart w:id="2029" w:name="d4-component-breakdown"/>
     <w:p>
       <w:pPr>
         <w:pStyle w:val="Heading2"/>
@@ -21313,8 +21325,8 @@
         <w:t xml:space="preserve"> scripts/component_breakdown.py</w:t>
       </w:r>
     </w:p>
-    <w:bookmarkEnd w:id="1933"/>
-    <w:bookmarkStart w:id="1934" w:name="d5-feature-validity-and-effect-sizes"/>
+    <w:bookmarkEnd w:id="2029"/>
+    <w:bookmarkStart w:id="2030" w:name="d5-feature-validity-and-effect-sizes"/>
     <w:p>
       <w:pPr>
         <w:pStyle w:val="Heading2"/>
@@ -21407,8 +21419,8 @@
         <w:t xml:space="preserve">. Under a different pandas version the regenerated values agree with the recorded ones to within floating-point rounding rather than byte for byte.</w:t>
       </w:r>
     </w:p>
-    <w:bookmarkEnd w:id="1934"/>
-    <w:bookmarkStart w:id="1935" w:name="d6-full-workflow"/>
+    <w:bookmarkEnd w:id="2030"/>
+    <w:bookmarkStart w:id="2031" w:name="d6-full-workflow"/>
     <w:p>
       <w:pPr>
         <w:pStyle w:val="Heading2"/>
@@ -21522,8 +21534,8 @@
         <w:t xml:space="preserve"> scripts/run_complete_workflow.py</w:t>
       </w:r>
     </w:p>
-    <w:bookmarkEnd w:id="1935"/>
-    <w:bookmarkStart w:id="1936" w:name="d7-scale-check"/>
+    <w:bookmarkEnd w:id="2031"/>
+    <w:bookmarkStart w:id="2032" w:name="d7-scale-check"/>
     <w:p>
       <w:pPr>
         <w:pStyle w:val="Heading2"/>
@@ -21593,8 +21605,8 @@
         <w:t xml:space="preserve"> output</w:t>
       </w:r>
     </w:p>
-    <w:bookmarkEnd w:id="1936"/>
-    <w:bookmarkStart w:id="1937" w:name="d8-strict-examiner-audit"/>
+    <w:bookmarkEnd w:id="2032"/>
+    <w:bookmarkStart w:id="2033" w:name="d8-strict-examiner-audit"/>
     <w:p>
       <w:pPr>
         <w:pStyle w:val="Heading2"/>
@@ -21628,8 +21640,8 @@
         <w:t xml:space="preserve"> scripts/strict_examiner_audit.py</w:t>
       </w:r>
     </w:p>
-    <w:bookmarkEnd w:id="1937"/>
-    <w:bookmarkStart w:id="1938" w:name="d9-report-figures"/>
+    <w:bookmarkEnd w:id="2033"/>
+    <w:bookmarkStart w:id="2034" w:name="d9-report-figures"/>
     <w:p>
       <w:pPr>
         <w:pStyle w:val="Heading2"/>
@@ -21663,8 +21675,8 @@
         <w:t xml:space="preserve"> scripts/build_report_figures.py</w:t>
       </w:r>
     </w:p>
-    <w:bookmarkEnd w:id="1938"/>
-    <w:bookmarkStart w:id="1939" w:name="d10-canonical-validation-set"/>
+    <w:bookmarkEnd w:id="2034"/>
+    <w:bookmarkStart w:id="2035" w:name="d10-canonical-validation-set"/>
     <w:p>
       <w:pPr>
         <w:pStyle w:val="Heading2"/>
@@ -21766,8 +21778,8 @@
         <w:t xml:space="preserve">Expected: precision 1.0000, recall 1.0000, F1 1.0000, with the four speeding interviews categorised suspicious rather than anomalous (section 6.1).</w:t>
       </w:r>
     </w:p>
-    <w:bookmarkEnd w:id="1939"/>
-    <w:bookmarkStart w:id="1940" w:name="Xb9631fa5fcc68a5e7d40e781c05acbfc9d5cbc6"/>
+    <w:bookmarkEnd w:id="2035"/>
+    <w:bookmarkStart w:id="2036" w:name="Xb9631fa5fcc68a5e7d40e781c05acbfc9d5cbc6"/>
     <w:p>
       <w:pPr>
         <w:pStyle w:val="Heading2"/>
@@ -21861,8 +21873,8 @@
         <w:t xml:space="preserve"> scripts/paginate_report.py</w:t>
       </w:r>
     </w:p>
-    <w:bookmarkEnd w:id="1940"/>
-    <w:bookmarkStart w:id="1941" w:name="X36cd4b068f4a92a24b93ce0646bf8da4dbd399c"/>
+    <w:bookmarkEnd w:id="2036"/>
+    <w:bookmarkStart w:id="2037" w:name="X36cd4b068f4a92a24b93ce0646bf8da4dbd399c"/>
     <w:p>
       <w:pPr>
         <w:pStyle w:val="Heading2"/>
@@ -21911,8 +21923,8 @@
         <w:t xml:space="preserve"> scripts/baseline_breakdown.py</w:t>
       </w:r>
     </w:p>
-    <w:bookmarkEnd w:id="1941"/>
-    <w:bookmarkStart w:id="1942" w:name="d13-platform-parity-on-matched-histories"/>
+    <w:bookmarkEnd w:id="2037"/>
+    <w:bookmarkStart w:id="2038" w:name="d13-platform-parity-on-matched-histories"/>
     <w:p>
       <w:pPr>
         <w:pStyle w:val="Heading2"/>
@@ -21946,8 +21958,8 @@
         <w:t xml:space="preserve"> scripts/run_platform_parity.py</w:t>
       </w:r>
     </w:p>
-    <w:bookmarkEnd w:id="1942"/>
-    <w:bookmarkStart w:id="1943" w:name="d14-peak-memory"/>
+    <w:bookmarkEnd w:id="2038"/>
+    <w:bookmarkStart w:id="2039" w:name="d14-peak-memory"/>
     <w:p>
       <w:pPr>
         <w:pStyle w:val="Heading2"/>
@@ -22024,9 +22036,9 @@
         </w:pict>
       </w:r>
     </w:p>
-    <w:bookmarkEnd w:id="1943"/>
-    <w:bookmarkEnd w:id="1944"/>
-    <w:bookmarkStart w:id="1972" w:name="appendix-e-reference-verification-record"/>
+    <w:bookmarkEnd w:id="2039"/>
+    <w:bookmarkEnd w:id="2040"/>
+    <w:bookmarkStart w:id="2068" w:name="appendix-e-reference-verification-record"/>
     <w:p>
       <w:pPr>
         <w:pStyle w:val="Heading1"/>
@@ -22224,7 +22236,7 @@
               <w:pStyle w:val="Compact"/>
               <w:jc w:val="left"/>
             </w:pPr>
-            <w:hyperlink r:id="rId1945">
+            <w:hyperlink r:id="rId2041">
               <w:r>
                 <w:rPr>
                   <w:rStyle w:val="Hyperlink"/>
@@ -22417,7 +22429,7 @@
               <w:pStyle w:val="Compact"/>
               <w:jc w:val="left"/>
             </w:pPr>
-            <w:hyperlink r:id="rId1946">
+            <w:hyperlink r:id="rId2042">
               <w:r>
                 <w:rPr>
                   <w:rStyle w:val="Hyperlink"/>
@@ -22506,7 +22518,7 @@
               <w:pStyle w:val="Compact"/>
               <w:jc w:val="left"/>
             </w:pPr>
-            <w:hyperlink r:id="rId1947">
+            <w:hyperlink r:id="rId2043">
               <w:r>
                 <w:rPr>
                   <w:rStyle w:val="Hyperlink"/>
@@ -22582,7 +22594,7 @@
               <w:pStyle w:val="Compact"/>
               <w:jc w:val="left"/>
             </w:pPr>
-            <w:hyperlink r:id="rId1948">
+            <w:hyperlink r:id="rId2044">
               <w:r>
                 <w:rPr>
                   <w:rStyle w:val="Hyperlink"/>
@@ -22661,7 +22673,7 @@
               <w:pStyle w:val="Compact"/>
               <w:jc w:val="left"/>
             </w:pPr>
-            <w:hyperlink r:id="rId1949">
+            <w:hyperlink r:id="rId2045">
               <w:r>
                 <w:rPr>
                   <w:rStyle w:val="Hyperlink"/>
@@ -22724,7 +22736,7 @@
               <w:pStyle w:val="Compact"/>
               <w:jc w:val="left"/>
             </w:pPr>
-            <w:hyperlink r:id="rId1912">
+            <w:hyperlink r:id="rId2008">
               <w:r>
                 <w:rPr>
                   <w:rStyle w:val="Hyperlink"/>
@@ -22803,7 +22815,7 @@
               <w:pStyle w:val="Compact"/>
               <w:jc w:val="left"/>
             </w:pPr>
-            <w:hyperlink r:id="rId1950">
+            <w:hyperlink r:id="rId2046">
               <w:r>
                 <w:rPr>
                   <w:rStyle w:val="Hyperlink"/>
@@ -22879,7 +22891,7 @@
               <w:pStyle w:val="Compact"/>
               <w:jc w:val="left"/>
             </w:pPr>
-            <w:hyperlink r:id="rId1951">
+            <w:hyperlink r:id="rId2047">
               <w:r>
                 <w:rPr>
                   <w:rStyle w:val="Hyperlink"/>
@@ -22958,7 +22970,7 @@
               <w:pStyle w:val="Compact"/>
               <w:jc w:val="left"/>
             </w:pPr>
-            <w:hyperlink r:id="rId1952">
+            <w:hyperlink r:id="rId2048">
               <w:r>
                 <w:rPr>
                   <w:rStyle w:val="Hyperlink"/>
@@ -23021,7 +23033,7 @@
               <w:pStyle w:val="Compact"/>
               <w:jc w:val="left"/>
             </w:pPr>
-            <w:hyperlink r:id="rId1913">
+            <w:hyperlink r:id="rId2009">
               <w:r>
                 <w:rPr>
                   <w:rStyle w:val="Hyperlink"/>
@@ -23100,7 +23112,7 @@
               <w:pStyle w:val="Compact"/>
               <w:jc w:val="left"/>
             </w:pPr>
-            <w:hyperlink r:id="rId1953">
+            <w:hyperlink r:id="rId2049">
               <w:r>
                 <w:rPr>
                   <w:rStyle w:val="Hyperlink"/>
@@ -23163,7 +23175,7 @@
               <w:pStyle w:val="Compact"/>
               <w:jc w:val="left"/>
             </w:pPr>
-            <w:hyperlink r:id="rId1954">
+            <w:hyperlink r:id="rId2050">
               <w:r>
                 <w:rPr>
                   <w:rStyle w:val="Hyperlink"/>
@@ -23320,7 +23332,7 @@
               <w:pStyle w:val="Compact"/>
               <w:jc w:val="left"/>
             </w:pPr>
-            <w:hyperlink r:id="rId1955">
+            <w:hyperlink r:id="rId2051">
               <w:r>
                 <w:rPr>
                   <w:rStyle w:val="Hyperlink"/>
@@ -23393,7 +23405,7 @@
               <w:pStyle w:val="Compact"/>
               <w:jc w:val="left"/>
             </w:pPr>
-            <w:hyperlink r:id="rId1956">
+            <w:hyperlink r:id="rId2052">
               <w:r>
                 <w:rPr>
                   <w:rStyle w:val="Hyperlink"/>
@@ -23472,7 +23484,7 @@
               <w:pStyle w:val="Compact"/>
               <w:jc w:val="left"/>
             </w:pPr>
-            <w:hyperlink r:id="rId1957">
+            <w:hyperlink r:id="rId2053">
               <w:r>
                 <w:rPr>
                   <w:rStyle w:val="Hyperlink"/>
@@ -23545,7 +23557,7 @@
               <w:pStyle w:val="Compact"/>
               <w:jc w:val="left"/>
             </w:pPr>
-            <w:hyperlink r:id="rId1958">
+            <w:hyperlink r:id="rId2054">
               <w:r>
                 <w:rPr>
                   <w:rStyle w:val="Hyperlink"/>
@@ -23624,7 +23636,7 @@
               <w:pStyle w:val="Compact"/>
               <w:jc w:val="left"/>
             </w:pPr>
-            <w:hyperlink r:id="rId1959">
+            <w:hyperlink r:id="rId2055">
               <w:r>
                 <w:rPr>
                   <w:rStyle w:val="Hyperlink"/>
@@ -23771,7 +23783,7 @@
               <w:pStyle w:val="Compact"/>
               <w:jc w:val="left"/>
             </w:pPr>
-            <w:hyperlink r:id="rId1960">
+            <w:hyperlink r:id="rId2056">
               <w:r>
                 <w:rPr>
                   <w:rStyle w:val="Hyperlink"/>
@@ -23850,7 +23862,7 @@
               <w:pStyle w:val="Compact"/>
               <w:jc w:val="left"/>
             </w:pPr>
-            <w:hyperlink r:id="rId1961">
+            <w:hyperlink r:id="rId2057">
               <w:r>
                 <w:rPr>
                   <w:rStyle w:val="Hyperlink"/>
@@ -23923,7 +23935,7 @@
               <w:pStyle w:val="Compact"/>
               <w:jc w:val="left"/>
             </w:pPr>
-            <w:hyperlink r:id="rId1962">
+            <w:hyperlink r:id="rId2058">
               <w:r>
                 <w:rPr>
                   <w:rStyle w:val="Hyperlink"/>
@@ -24002,7 +24014,7 @@
               <w:pStyle w:val="Compact"/>
               <w:jc w:val="left"/>
             </w:pPr>
-            <w:hyperlink r:id="rId1963">
+            <w:hyperlink r:id="rId2059">
               <w:r>
                 <w:rPr>
                   <w:rStyle w:val="Hyperlink"/>
@@ -24146,7 +24158,7 @@
               <w:pStyle w:val="Compact"/>
               <w:jc w:val="left"/>
             </w:pPr>
-            <w:hyperlink r:id="rId1914">
+            <w:hyperlink r:id="rId2010">
               <w:r>
                 <w:rPr>
                   <w:rStyle w:val="Hyperlink"/>
@@ -24225,7 +24237,7 @@
               <w:pStyle w:val="Compact"/>
               <w:jc w:val="left"/>
             </w:pPr>
-            <w:hyperlink r:id="rId1964">
+            <w:hyperlink r:id="rId2060">
               <w:r>
                 <w:rPr>
                   <w:rStyle w:val="Hyperlink"/>
@@ -24298,7 +24310,7 @@
               <w:pStyle w:val="Compact"/>
               <w:jc w:val="left"/>
             </w:pPr>
-            <w:hyperlink r:id="rId1915">
+            <w:hyperlink r:id="rId2011">
               <w:r>
                 <w:rPr>
                   <w:rStyle w:val="Hyperlink"/>
@@ -24371,7 +24383,7 @@
               <w:pStyle w:val="Compact"/>
               <w:jc w:val="left"/>
             </w:pPr>
-            <w:hyperlink r:id="rId1916">
+            <w:hyperlink r:id="rId2012">
               <w:r>
                 <w:rPr>
                   <w:rStyle w:val="Hyperlink"/>
@@ -24518,7 +24530,7 @@
               <w:pStyle w:val="Compact"/>
               <w:jc w:val="left"/>
             </w:pPr>
-            <w:hyperlink r:id="rId1965">
+            <w:hyperlink r:id="rId2061">
               <w:r>
                 <w:rPr>
                   <w:rStyle w:val="Hyperlink"/>
@@ -24597,7 +24609,7 @@
               <w:pStyle w:val="Compact"/>
               <w:jc w:val="left"/>
             </w:pPr>
-            <w:hyperlink r:id="rId1966">
+            <w:hyperlink r:id="rId2062">
               <w:r>
                 <w:rPr>
                   <w:rStyle w:val="Hyperlink"/>
@@ -24771,7 +24783,7 @@
               <w:pStyle w:val="Compact"/>
               <w:jc w:val="left"/>
             </w:pPr>
-            <w:hyperlink r:id="rId1967">
+            <w:hyperlink r:id="rId2063">
               <w:r>
                 <w:rPr>
                   <w:rStyle w:val="Hyperlink"/>
@@ -24836,7 +24848,7 @@
               <w:pStyle w:val="Compact"/>
               <w:jc w:val="left"/>
             </w:pPr>
-            <w:hyperlink r:id="rId1968">
+            <w:hyperlink r:id="rId2064">
               <w:r>
                 <w:rPr>
                   <w:rStyle w:val="Hyperlink"/>
@@ -24901,7 +24913,7 @@
               <w:pStyle w:val="Compact"/>
               <w:jc w:val="left"/>
             </w:pPr>
-            <w:hyperlink r:id="rId1969">
+            <w:hyperlink r:id="rId2065">
               <w:r>
                 <w:rPr>
                   <w:rStyle w:val="Hyperlink"/>
@@ -24966,7 +24978,7 @@
               <w:pStyle w:val="Compact"/>
               <w:jc w:val="left"/>
             </w:pPr>
-            <w:hyperlink r:id="rId1970">
+            <w:hyperlink r:id="rId2066">
               <w:r>
                 <w:rPr>
                   <w:rStyle w:val="Hyperlink"/>
@@ -25031,7 +25043,7 @@
               <w:pStyle w:val="Compact"/>
               <w:jc w:val="left"/>
             </w:pPr>
-            <w:hyperlink r:id="rId1971">
+            <w:hyperlink r:id="rId2067">
               <w:r>
                 <w:rPr>
                   <w:rStyle w:val="Hyperlink"/>
@@ -25064,8 +25076,8 @@
         </w:pict>
       </w:r>
     </w:p>
-    <w:bookmarkEnd w:id="1972"/>
-    <w:bookmarkStart w:id="1973" w:name="appendix-f-feature-to-source-map"/>
+    <w:bookmarkEnd w:id="2068"/>
+    <w:bookmarkStart w:id="2069" w:name="appendix-f-feature-to-source-map"/>
     <w:p>
       <w:pPr>
         <w:pStyle w:val="Heading1"/>
@@ -27508,7 +27520,7 @@
         </w:tc>
       </w:tr>
     </w:tbl>
-    <w:bookmarkEnd w:id="1973"/>
+    <w:bookmarkEnd w:id="2069"/>
     <w:sectPr>
       <w:footerReference r:id="rId13" w:type="default"/>
       <w:footnotePr>

</xml_diff>